<commit_message>
Refine proposal design and add frontend-design skill
Co-Authored-By: Claude Sonnet 5.5 <noreply@anthropic.com>
Claude-Session: https://claude.ai/code/session_01Tngv28N1djZy5yqo2Q1yZ6
</commit_message>
<xml_diff>
--- a/Blake_Telecom_Leased_Line_Solutions.docx
+++ b/Blake_Telecom_Leased_Line_Solutions.docx
@@ -210,6 +210,7 @@
     <w:p>
       <w:pPr>
         <w:spacing w:after="160" w:line="288"/>
+        <w:ind w:right="1700"/>
       </w:pPr>
       <w:r>
         <w:t xml:space="preserve">Every email, video meeting, cloud file and customer call depends on one thing: your internet connection. When it slows down or drops, work slows down with it.</w:t>
@@ -218,6 +219,7 @@
     <w:p>
       <w:pPr>
         <w:spacing w:after="160" w:line="288"/>
+        <w:ind w:right="1700"/>
       </w:pPr>
       <w:r>
         <w:t xml:space="preserve">A leased line is a private fibre connection built for your business alone. Nobody shares it with you, so the speed you order is the speed you get, at every hour of the day, in both directions.</w:t>
@@ -226,6 +228,7 @@
     <w:p>
       <w:pPr>
         <w:spacing w:after="160" w:line="288"/>
+        <w:ind w:right="1700"/>
       </w:pPr>
       <w:r>
         <w:t xml:space="preserve">At Blake Telecom we have been connecting UK businesses since 2004. We are independent, so we compare the leading carriers for you and recommend the circuit that genuinely fits, rather than the one we happen to be tied to.</w:t>
@@ -249,11 +252,9 @@
         </w:tblBorders>
       </w:tblPr>
       <w:tblGrid>
-        <w:gridCol w:w="3182"/>
-        <w:gridCol w:w="200"/>
-        <w:gridCol w:w="3182"/>
-        <w:gridCol w:w="200"/>
-        <w:gridCol w:w="2982"/>
+        <w:gridCol w:w="3248"/>
+        <w:gridCol w:w="3249"/>
+        <w:gridCol w:w="3249"/>
       </w:tblGrid>
       <w:tr>
         <w:trPr>
@@ -261,32 +262,31 @@
         </w:trPr>
         <w:tc>
           <w:tcPr>
-            <w:tcW w:type="dxa" w:w="3182"/>
-            <w:tcBorders>
-              <w:top w:val="none" w:color="FFFFFF" w:sz="0"/>
+            <w:tcW w:type="dxa" w:w="3248"/>
+            <w:tcBorders>
+              <w:top w:val="single" w:color="0070B0" w:sz="18"/>
               <w:left w:val="none" w:color="FFFFFF" w:sz="0"/>
               <w:bottom w:val="none" w:color="FFFFFF" w:sz="0"/>
               <w:right w:val="none" w:color="FFFFFF" w:sz="0"/>
             </w:tcBorders>
-            <w:shd w:fill="0070B0" w:color="auto" w:val="clear"/>
-            <w:tcMar>
-              <w:top w:type="dxa" w:w="160"/>
-              <w:left w:type="dxa" w:w="160"/>
-              <w:bottom w:type="dxa" w:w="160"/>
-              <w:right w:type="dxa" w:w="160"/>
-            </w:tcMar>
-            <w:vAlign w:val="center"/>
-          </w:tcPr>
-          <w:p>
-            <w:pPr>
-              <w:spacing w:after="40"/>
-              <w:jc w:val="center"/>
-            </w:pPr>
-            <w:r>
-              <w:rPr>
-                <w:b/>
-                <w:bCs/>
-                <w:color w:val="FFFFFF"/>
+            <w:shd w:fill="EEF5FA" w:color="auto" w:val="clear"/>
+            <w:tcMar>
+              <w:top w:type="dxa" w:w="200"/>
+              <w:left w:type="dxa" w:w="200"/>
+              <w:bottom w:type="dxa" w:w="200"/>
+              <w:right w:type="dxa" w:w="200"/>
+            </w:tcMar>
+            <w:vAlign w:val="center"/>
+          </w:tcPr>
+          <w:p>
+            <w:pPr>
+              <w:spacing w:after="30"/>
+            </w:pPr>
+            <w:r>
+              <w:rPr>
+                <w:b/>
+                <w:bCs/>
+                <w:color w:val="0070B0"/>
                 <w:sz w:val="28"/>
                 <w:szCs w:val="28"/>
               </w:rPr>
@@ -294,12 +294,9 @@
             </w:r>
           </w:p>
           <w:p>
-            <w:pPr>
-              <w:jc w:val="center"/>
-            </w:pPr>
-            <w:r>
-              <w:rPr>
-                <w:color w:val="FFFFFF"/>
+            <w:r>
+              <w:rPr>
+                <w:color w:val="5A6B7C"/>
                 <w:sz w:val="19"/>
                 <w:szCs w:val="19"/>
               </w:rPr>
@@ -309,44 +306,31 @@
         </w:tc>
         <w:tc>
           <w:tcPr>
-            <w:tcW w:type="dxa" w:w="200"/>
-            <w:tcBorders>
-              <w:top w:val="none" w:color="FFFFFF" w:sz="0"/>
-              <w:left w:val="none" w:color="FFFFFF" w:sz="0"/>
+            <w:tcW w:type="dxa" w:w="3249"/>
+            <w:tcBorders>
+              <w:top w:val="single" w:color="0070B0" w:sz="18"/>
+              <w:left w:val="single" w:color="CFE2EF" w:sz="6"/>
               <w:bottom w:val="none" w:color="FFFFFF" w:sz="0"/>
               <w:right w:val="none" w:color="FFFFFF" w:sz="0"/>
             </w:tcBorders>
-          </w:tcPr>
-          <w:p/>
-        </w:tc>
-        <w:tc>
-          <w:tcPr>
-            <w:tcW w:type="dxa" w:w="3182"/>
-            <w:tcBorders>
-              <w:top w:val="none" w:color="FFFFFF" w:sz="0"/>
-              <w:left w:val="none" w:color="FFFFFF" w:sz="0"/>
-              <w:bottom w:val="none" w:color="FFFFFF" w:sz="0"/>
-              <w:right w:val="none" w:color="FFFFFF" w:sz="0"/>
-            </w:tcBorders>
-            <w:shd w:fill="902080" w:color="auto" w:val="clear"/>
-            <w:tcMar>
-              <w:top w:type="dxa" w:w="160"/>
-              <w:left w:type="dxa" w:w="160"/>
-              <w:bottom w:type="dxa" w:w="160"/>
-              <w:right w:type="dxa" w:w="160"/>
-            </w:tcMar>
-            <w:vAlign w:val="center"/>
-          </w:tcPr>
-          <w:p>
-            <w:pPr>
-              <w:spacing w:after="40"/>
-              <w:jc w:val="center"/>
-            </w:pPr>
-            <w:r>
-              <w:rPr>
-                <w:b/>
-                <w:bCs/>
-                <w:color w:val="FFFFFF"/>
+            <w:shd w:fill="EEF5FA" w:color="auto" w:val="clear"/>
+            <w:tcMar>
+              <w:top w:type="dxa" w:w="200"/>
+              <w:left w:type="dxa" w:w="200"/>
+              <w:bottom w:type="dxa" w:w="200"/>
+              <w:right w:type="dxa" w:w="200"/>
+            </w:tcMar>
+            <w:vAlign w:val="center"/>
+          </w:tcPr>
+          <w:p>
+            <w:pPr>
+              <w:spacing w:after="30"/>
+            </w:pPr>
+            <w:r>
+              <w:rPr>
+                <w:b/>
+                <w:bCs/>
+                <w:color w:val="0070B0"/>
                 <w:sz w:val="28"/>
                 <w:szCs w:val="28"/>
               </w:rPr>
@@ -354,12 +338,9 @@
             </w:r>
           </w:p>
           <w:p>
-            <w:pPr>
-              <w:jc w:val="center"/>
-            </w:pPr>
-            <w:r>
-              <w:rPr>
-                <w:color w:val="FFFFFF"/>
+            <w:r>
+              <w:rPr>
+                <w:color w:val="5A6B7C"/>
                 <w:sz w:val="19"/>
                 <w:szCs w:val="19"/>
               </w:rPr>
@@ -369,44 +350,31 @@
         </w:tc>
         <w:tc>
           <w:tcPr>
-            <w:tcW w:type="dxa" w:w="200"/>
-            <w:tcBorders>
-              <w:top w:val="none" w:color="FFFFFF" w:sz="0"/>
-              <w:left w:val="none" w:color="FFFFFF" w:sz="0"/>
+            <w:tcW w:type="dxa" w:w="3249"/>
+            <w:tcBorders>
+              <w:top w:val="single" w:color="0070B0" w:sz="18"/>
+              <w:left w:val="single" w:color="CFE2EF" w:sz="6"/>
               <w:bottom w:val="none" w:color="FFFFFF" w:sz="0"/>
               <w:right w:val="none" w:color="FFFFFF" w:sz="0"/>
             </w:tcBorders>
-          </w:tcPr>
-          <w:p/>
-        </w:tc>
-        <w:tc>
-          <w:tcPr>
-            <w:tcW w:type="dxa" w:w="2982"/>
-            <w:tcBorders>
-              <w:top w:val="none" w:color="FFFFFF" w:sz="0"/>
-              <w:left w:val="none" w:color="FFFFFF" w:sz="0"/>
-              <w:bottom w:val="none" w:color="FFFFFF" w:sz="0"/>
-              <w:right w:val="none" w:color="FFFFFF" w:sz="0"/>
-            </w:tcBorders>
-            <w:shd w:fill="0090C0" w:color="auto" w:val="clear"/>
-            <w:tcMar>
-              <w:top w:type="dxa" w:w="160"/>
-              <w:left w:type="dxa" w:w="160"/>
-              <w:bottom w:type="dxa" w:w="160"/>
-              <w:right w:type="dxa" w:w="160"/>
-            </w:tcMar>
-            <w:vAlign w:val="center"/>
-          </w:tcPr>
-          <w:p>
-            <w:pPr>
-              <w:spacing w:after="40"/>
-              <w:jc w:val="center"/>
-            </w:pPr>
-            <w:r>
-              <w:rPr>
-                <w:b/>
-                <w:bCs/>
-                <w:color w:val="FFFFFF"/>
+            <w:shd w:fill="EEF5FA" w:color="auto" w:val="clear"/>
+            <w:tcMar>
+              <w:top w:type="dxa" w:w="200"/>
+              <w:left w:type="dxa" w:w="200"/>
+              <w:bottom w:type="dxa" w:w="200"/>
+              <w:right w:type="dxa" w:w="200"/>
+            </w:tcMar>
+            <w:vAlign w:val="center"/>
+          </w:tcPr>
+          <w:p>
+            <w:pPr>
+              <w:spacing w:after="30"/>
+            </w:pPr>
+            <w:r>
+              <w:rPr>
+                <w:b/>
+                <w:bCs/>
+                <w:color w:val="0070B0"/>
                 <w:sz w:val="28"/>
                 <w:szCs w:val="28"/>
               </w:rPr>
@@ -414,12 +382,9 @@
             </w:r>
           </w:p>
           <w:p>
-            <w:pPr>
-              <w:jc w:val="center"/>
-            </w:pPr>
-            <w:r>
-              <w:rPr>
-                <w:color w:val="FFFFFF"/>
+            <w:r>
+              <w:rPr>
+                <w:color w:val="5A6B7C"/>
                 <w:sz w:val="19"/>
                 <w:szCs w:val="19"/>
               </w:rPr>
@@ -835,6 +800,7 @@
     <w:p>
       <w:pPr>
         <w:spacing w:after="160" w:line="288"/>
+        <w:ind w:right="1700"/>
       </w:pPr>
       <w:r>
         <w:t xml:space="preserve">Broadband is a sensible choice for smaller teams with light needs. Once you rely on cloud software, hosted telephony, video calls or large file transfers, the differences start to matter. Here is how the two compare.</w:t>
@@ -1690,6 +1656,7 @@
     <w:p>
       <w:pPr>
         <w:spacing w:after="160" w:line="288"/>
+        <w:ind w:right="1700"/>
       </w:pPr>
       <w:r>
         <w:t xml:space="preserve">If you already use, or are planning, a hosted voice system, a leased line is the natural partner. Voice calls need a steady flow of data, and a dedicated circuit keeps every conversation clear, even while colleagues are on video meetings and uploading files.</w:t>
@@ -1710,6 +1677,7 @@
     <w:p>
       <w:pPr>
         <w:spacing w:after="160" w:line="288"/>
+        <w:ind w:right="1700"/>
       </w:pPr>
       <w:r>
         <w:t xml:space="preserve">We offer a full range of dedicated connectivity, designed around the way your business works.</w:t>
@@ -1801,7 +1769,7 @@
             <w:tcW w:type="dxa" w:w="4773"/>
             <w:tcBorders>
               <w:top w:val="none" w:color="FFFFFF" w:sz="0"/>
-              <w:left w:val="single" w:color="902080" w:sz="24"/>
+              <w:left w:val="single" w:color="0090C0" w:sz="24"/>
               <w:bottom w:val="none" w:color="FFFFFF" w:sz="0"/>
               <w:right w:val="none" w:color="FFFFFF" w:sz="0"/>
             </w:tcBorders>
@@ -1823,7 +1791,7 @@
               <w:rPr>
                 <w:b/>
                 <w:bCs/>
-                <w:color w:val="902080"/>
+                <w:color w:val="0070B0"/>
                 <w:sz w:val="25"/>
                 <w:szCs w:val="25"/>
               </w:rPr>
@@ -1859,6 +1827,7 @@
       <w:pPr>
         <w:keepNext/>
         <w:spacing w:after="120" w:line="288"/>
+        <w:ind w:right="1700"/>
       </w:pPr>
       <w:r>
         <w:t xml:space="preserve">Bandwidth is matched to the way you work today, with room to grow. We can upgrade your circuit as your business expands, often without changing the fibre.</w:t>
@@ -2248,6 +2217,7 @@
     <w:p>
       <w:pPr>
         <w:spacing w:after="160" w:line="288"/>
+        <w:ind w:right="1700"/>
       </w:pPr>
       <w:r>
         <w:t xml:space="preserve">We manage the whole process, so you do not have to chase carriers or engineers. Here is what to expect.</w:t>
@@ -2696,6 +2666,7 @@
     <w:p>
       <w:pPr>
         <w:spacing w:after="160" w:line="288"/>
+        <w:ind w:right="1700"/>
       </w:pPr>
       <w:r>
         <w:t xml:space="preserve">We have completed our tests on your exchange and the products available in your area, and you have a few options to choose from. Please note that these services are not delivered on the BT Openreach network and are offered on various terms.</w:t>
@@ -3608,7 +3579,7 @@
               <w:bottom w:val="none" w:color="FFFFFF" w:sz="0"/>
               <w:right w:val="none" w:color="FFFFFF" w:sz="0"/>
             </w:tcBorders>
-            <w:shd w:fill="902080" w:color="auto" w:val="clear"/>
+            <w:shd w:fill="0090C0" w:color="auto" w:val="clear"/>
             <w:tcMar>
               <w:top w:type="dxa" w:w="80"/>
               <w:left w:type="dxa" w:w="140"/>
@@ -5286,7 +5257,7 @@
               <w:bottom w:val="none" w:color="FFFFFF" w:sz="0"/>
               <w:right w:val="none" w:color="FFFFFF" w:sz="0"/>
             </w:tcBorders>
-            <w:shd w:fill="0090C0" w:color="auto" w:val="clear"/>
+            <w:shd w:fill="5A6B7C" w:color="auto" w:val="clear"/>
             <w:tcMar>
               <w:top w:type="dxa" w:w="80"/>
               <w:left w:type="dxa" w:w="140"/>
@@ -6065,6 +6036,7 @@
     <w:p>
       <w:pPr>
         <w:spacing w:after="160" w:line="288"/>
+        <w:ind w:right="0"/>
       </w:pPr>
       <w:r>
         <w:rPr>
@@ -6102,6 +6074,7 @@
     <w:p>
       <w:pPr>
         <w:spacing w:after="160" w:line="288"/>
+        <w:ind w:right="1700"/>
       </w:pPr>
       <w:r>
         <w:t xml:space="preserve">A leased line is a dedicated fibre connection between your premises and the internet or another of your sites. The capacity is reserved for your business only, so it stays fast and consistent.</w:t>
@@ -6119,6 +6092,7 @@
     <w:p>
       <w:pPr>
         <w:spacing w:after="160" w:line="288"/>
+        <w:ind w:right="1700"/>
       </w:pPr>
       <w:r>
         <w:t xml:space="preserve">No. Fibre broadband is shared with other customers and usually offers much slower uploads. A leased line is uncontended, offers matching upload and download speeds and includes stronger support.</w:t>
@@ -6136,6 +6110,7 @@
     <w:p>
       <w:pPr>
         <w:spacing w:after="160" w:line="288"/>
+        <w:ind w:right="1700"/>
       </w:pPr>
       <w:r>
         <w:t xml:space="preserve">Speeds typically range from 10Mbps to 10Gbps and beyond. We help you choose a sensible starting point and can increase it as you grow.</w:t>
@@ -6153,6 +6128,7 @@
     <w:p>
       <w:pPr>
         <w:spacing w:after="160" w:line="288"/>
+        <w:ind w:right="1700"/>
       </w:pPr>
       <w:r>
         <w:t xml:space="preserve">We monitor your line and escalate faults to the carrier immediately. For extra protection, add a mobile backup or a second circuit so your business stays online while a fault is repaired.</w:t>
@@ -6170,6 +6146,7 @@
     <w:p>
       <w:pPr>
         <w:spacing w:after="160" w:line="288"/>
+        <w:ind w:right="1700"/>
       </w:pPr>
       <w:r>
         <w:t xml:space="preserve">Yes. We port your numbers across to our hosted voice platform, and set up a temporary number while the move is completed so you never miss a call.</w:t>
@@ -6187,6 +6164,7 @@
     <w:p>
       <w:pPr>
         <w:spacing w:after="160" w:line="288"/>
+        <w:ind w:right="1700"/>
       </w:pPr>
       <w:r>
         <w:t xml:space="preserve">Absolutely. Dedicated bandwidth is exactly what Microsoft 365, Google Workspace, video meetings and cloud telephony need to run smoothly.</w:t>
@@ -6207,6 +6185,7 @@
     <w:p>
       <w:pPr>
         <w:spacing w:after="160" w:line="288"/>
+        <w:ind w:right="1700"/>
       </w:pPr>
       <w:r>
         <w:t xml:space="preserve">Blake Telecom is an independent business communications provider based in Darlington, supplying customers throughout the UK since 2004. Our portfolio covers dedicated data connectivity, hosted voice, unified communications, business mobiles and audio visual equipment, all from one friendly team.</w:t>
@@ -6215,6 +6194,7 @@
     <w:p>
       <w:pPr>
         <w:spacing w:after="160" w:line="288"/>
+        <w:ind w:right="1700"/>
       </w:pPr>
       <w:r>
         <w:t xml:space="preserve">Because we are not tied to a single network, we can shop the market on your behalf and recommend the service that fits your needs and your budget. Many of our customers have stayed with us for well over a decade, which tells you a great deal about how we look after them.</w:t>
@@ -6222,7 +6202,7 @@
     </w:p>
     <w:p>
       <w:pPr>
-        <w:spacing w:after="120"/>
+        <w:spacing w:after="40"/>
       </w:pPr>
     </w:p>
     <w:tbl>
@@ -6317,7 +6297,7 @@
     </w:tbl>
     <w:p>
       <w:pPr>
-        <w:spacing w:after="200"/>
+        <w:spacing w:after="60"/>
       </w:pPr>
     </w:p>
     <w:p>

</xml_diff>